<commit_message>
feat(cad): video Modul 5 versi klik GUI (Braket L) dengan sketsa terkonstrain
- Rekaman klik GUI asli 7:50:
  - profil L dengan Polyline, lalu dimensi Sketcher (yang pertama menskalakan profil; jarak dimensi sama)
  - Pad 40; lubang di sketsa XZ (Diameter, Equal, posisi x 49, z 10/30) lalu Pocket Through all
  - Fillet R6 lewat sudut navigation cube; Chamfer 2
  - ubah tebal 12 -> 15 -> 12; massa aluminium 162,17 g
- Teks langkah 1-7 dengan angka volume dari konsol, posisi lubang di Gambar 7, dan dua baris gejala Sketcher.

Co-Authored-By: Claude Opus 5.5 <noreply@anthropic.com>
</commit_message>
<xml_diff>
--- a/Pemodelan-Computer-Aided-Design/Modul-Word/Modul-5-Pemodelan-3D-Berbasis-Sketsa-Extrude-Revolve-Sweep.docx
+++ b/Pemodelan-Computer-Aided-Design/Modul-Word/Modul-5-Pemodelan-3D-Berbasis-Sketsa-Extrude-Revolve-Sweep.docx
@@ -10065,7 +10065,7 @@
           <w:i w:val="0"/>
           <w:sz w:val="20"/>
         </w:rPr>
-        <w:t>Gambar 7 — Target praktik: braket L tiga dimensi. Satuan mm. Kiri: profil pada bidang XY dengan titik asal (0, 0) di sudut luar siku, yaitu polyline 6 titik 80 × 60 tebal 12 (langkah 1) setelah fillet dalam R6 (langkah 4) dan chamfer C2 pada dua rusuk luar ujung kaki (langkah 5). Kanan: isometrik setelah Pad 40 (langkah 2) dan dua lubang ⌀9 tembus di muka atas kaki mendatar (langkah 3).</w:t>
+        <w:t>Gambar 7 — Target praktik: braket L tiga dimensi. Satuan mm. Kiri: profil pada bidang XY dengan titik asal (0, 0) di sudut luar siku, yaitu polyline 6 titik 80 × 60 tebal 12 (langkah 1) setelah fillet dalam R6 (langkah 4) dan chamfer C2 pada dua rusuk luar ujung kaki (langkah 5). Kanan: isometrik setelah Pad 40 (langkah 2) dan dua lubang ⌀9 tembus pada kaki mendatar, pusat x 49 dan z 10/30 dari sketsa XZ (langkah 3).</w:t>
       </w:r>
     </w:p>
     <w:p>
@@ -10098,7 +10098,61 @@
           <w:i w:val="0"/>
           <w:sz w:val="22"/>
         </w:rPr>
-        <w:t>Part Design → Create body → Create sketch → XY. Gambar profil L braket: polyline 6 titik (80 × 60, tebal 12), konstrain coincident, H/V, jangkar ke origin, dimensi sampai Fully constrained. Close.</w:t>
+        <w:t xml:space="preserve">File → New Document; Part Design → New Body; Sketch → New Sketch → XY-plane. </w:t>
+      </w:r>
+      <w:r>
+        <w:rPr>
+          <w:rFonts w:ascii="Arial" w:hAnsi="Arial" w:eastAsia="Arial" w:cs="Arial"/>
+          <w:b/>
+          <w:i w:val="0"/>
+          <w:sz w:val="22"/>
+        </w:rPr>
+        <w:t>Polyline</w:t>
+      </w:r>
+      <w:r>
+        <w:rPr>
+          <w:rFonts w:ascii="Arial" w:hAnsi="Arial" w:eastAsia="Arial" w:cs="Arial"/>
+          <w:b w:val="0"/>
+          <w:i w:val="0"/>
+          <w:sz w:val="22"/>
+        </w:rPr>
+        <w:t xml:space="preserve">: klik pertama tepat di titik asal (Coincident otomatis), lalu gambar profil L kasar 6 titik; konstrain Horizontal/Vertical terpasang otomatis. Tekan Esc sekali untuk keluar dari Polyline. Pilih tepi bawah → Horizontal Dimension </w:t>
+      </w:r>
+      <w:r>
+        <w:rPr>
+          <w:rFonts w:ascii="Arial" w:hAnsi="Arial" w:eastAsia="Arial" w:cs="Arial"/>
+          <w:b/>
+          <w:i w:val="0"/>
+          <w:sz w:val="22"/>
+        </w:rPr>
+        <w:t>80</w:t>
+      </w:r>
+      <w:r>
+        <w:rPr>
+          <w:rFonts w:ascii="Arial" w:hAnsi="Arial" w:eastAsia="Arial" w:cs="Arial"/>
+          <w:b w:val="0"/>
+          <w:i w:val="0"/>
+          <w:sz w:val="22"/>
+        </w:rPr>
+        <w:t xml:space="preserve">: dimensi pertama menskalakan seluruh profil; Fit All. Tepi kiri → Vertical Dimension 60; tepi kanan kaki mendatar → Vertical 12; tepi atas kaki tegak → Horizontal 12. Seret angka yang jatuh di dalam profil ke luar agar semua dimensi berjarak sama (±7 mm). Panel Sketch Edit menulis </w:t>
+      </w:r>
+      <w:r>
+        <w:rPr>
+          <w:rFonts w:ascii="Arial" w:hAnsi="Arial" w:eastAsia="Arial" w:cs="Arial"/>
+          <w:b w:val="0"/>
+          <w:i/>
+          <w:sz w:val="22"/>
+        </w:rPr>
+        <w:t>Fully constrained</w:t>
+      </w:r>
+      <w:r>
+        <w:rPr>
+          <w:rFonts w:ascii="Arial" w:hAnsi="Arial" w:eastAsia="Arial" w:cs="Arial"/>
+          <w:b w:val="0"/>
+          <w:i w:val="0"/>
+          <w:sz w:val="22"/>
+        </w:rPr>
+        <w:t xml:space="preserve"> → Close.</w:t>
       </w:r>
     </w:p>
     <w:p>
@@ -10131,7 +10185,7 @@
           <w:i w:val="0"/>
           <w:sz w:val="22"/>
         </w:rPr>
-        <w:t>Pad Length 40 mm. Baca Body.Shape.Volume di Python console dan bandingkan dengan luas profil × 40.</w:t>
+        <w:t>Pilih Sketch → Additive Features → Pad, Length 40 → OK; tekan 0 untuk tampilan isometrik. Python console: round(App.ActiveDocument.Body.Shape.Volume, 2) → 61.440,0 mm³ = luas profil 1.536 mm² × 40.</w:t>
       </w:r>
     </w:p>
     <w:p>
@@ -10164,7 +10218,43 @@
           <w:i w:val="0"/>
           <w:sz w:val="22"/>
         </w:rPr>
-        <w:t>Klik muka atas kaki mendatar → Create sketch → dua lingkaran ⌀9 (konstrain Diameter, posisi dari tepi) → Pocket Through all. Volume berkurang 2 × π·4,5² × 12.</w:t>
+        <w:t xml:space="preserve">Sketch → New Sketch → </w:t>
+      </w:r>
+      <w:r>
+        <w:rPr>
+          <w:rFonts w:ascii="Arial" w:hAnsi="Arial" w:eastAsia="Arial" w:cs="Arial"/>
+          <w:b/>
+          <w:i w:val="0"/>
+          <w:sz w:val="22"/>
+        </w:rPr>
+        <w:t>XZ-plane</w:t>
+      </w:r>
+      <w:r>
+        <w:rPr>
+          <w:rFonts w:ascii="Arial" w:hAnsi="Arial" w:eastAsia="Arial" w:cs="Arial"/>
+          <w:b w:val="0"/>
+          <w:i w:val="0"/>
+          <w:sz w:val="22"/>
+        </w:rPr>
+        <w:t xml:space="preserve"> (muka luar kaki mendatar), lalu tekan 1 (Front) karena sketsa XZ ditampilkan dari belakang. Circle From Center dua kali, Esc. Tepi lingkaran → Diameter Dimension 9; dua lingkaran → Equal; pusat pertama → Horizontal 49 dan Vertical 10; dua pusat → Vertical Constraint; pusat kedua → Vertical 30. Fully constrained → Close. Pilih Sketch001 → Pocket, Type </w:t>
+      </w:r>
+      <w:r>
+        <w:rPr>
+          <w:rFonts w:ascii="Arial" w:hAnsi="Arial" w:eastAsia="Arial" w:cs="Arial"/>
+          <w:b/>
+          <w:i w:val="0"/>
+          <w:sz w:val="22"/>
+        </w:rPr>
+        <w:t>Through all</w:t>
+      </w:r>
+      <w:r>
+        <w:rPr>
+          <w:rFonts w:ascii="Arial" w:hAnsi="Arial" w:eastAsia="Arial" w:cs="Arial"/>
+          <w:b w:val="0"/>
+          <w:i w:val="0"/>
+          <w:sz w:val="22"/>
+        </w:rPr>
+        <w:t>: volume 59.913,19 mm³ (berkurang 2 × π·4,5² × 12).</w:t>
       </w:r>
     </w:p>
     <w:p>
@@ -10197,7 +10287,25 @@
           <w:i w:val="0"/>
           <w:sz w:val="22"/>
         </w:rPr>
-        <w:t>Pilih rusuk dalam siku L (satu rusuk sepanjang 40 mm) → Fillet R6. Volume bertambah? Ya: fillet dalam mengisi sudut dalam dengan bahan; hitung selisihnya lewat Shape.Volume.</w:t>
+        <w:t xml:space="preserve">Rusuk dalam siku tertutup dinding pada tampilan isometrik biasa: klik sudut belakang-kanan-atas navigation cube. Pilih rusuk dalam (sepanjang 40 mm) → Dress-Up Features → Fillet, Radius 6 → OK. Volume </w:t>
+      </w:r>
+      <w:r>
+        <w:rPr>
+          <w:rFonts w:ascii="Arial" w:hAnsi="Arial" w:eastAsia="Arial" w:cs="Arial"/>
+          <w:b w:val="0"/>
+          <w:i/>
+          <w:sz w:val="22"/>
+        </w:rPr>
+        <w:t>bertambah</w:t>
+      </w:r>
+      <w:r>
+        <w:rPr>
+          <w:rFonts w:ascii="Arial" w:hAnsi="Arial" w:eastAsia="Arial" w:cs="Arial"/>
+          <w:b w:val="0"/>
+          <w:i w:val="0"/>
+          <w:sz w:val="22"/>
+        </w:rPr>
+        <w:t xml:space="preserve"> menjadi 60.222,21 mm³: fillet dalam mengisi sudut dengan bahan ≈ (1 − π/4)·6²·40 = 309,03 mm³.</w:t>
       </w:r>
     </w:p>
     <w:p>
@@ -10230,7 +10338,7 @@
           <w:i w:val="0"/>
           <w:sz w:val="22"/>
         </w:rPr>
-        <w:t>Pilih dua rusuk luar ujung kaki → Chamfer 2 mm. Periksa pohon fitur: Sketch, Pad, Sketch001, Pocket, Fillet, Chamfer; Tip = Chamfer.</w:t>
+        <w:t>Klik rusuk luar ujung kaki mendatar, Ctrl+klik rusuk luar ujung kaki tegak → Chamfer, Size 2 → OK. Pohon fitur: Sketch, Pad, Sketch001, Pocket, Fillet, Chamfer; Tip = Chamfer.</w:t>
       </w:r>
     </w:p>
     <w:p>
@@ -10263,7 +10371,7 @@
           <w:i w:val="0"/>
           <w:sz w:val="22"/>
         </w:rPr>
-        <w:t>Buka Sketch, ubah tebal 12 → 15, Close, recompute: semua fitur mengikuti tanpa dibuat ulang. Kembalikan ke 12.</w:t>
+        <w:t>Klik ganda Sketch, klik ganda angka tebal kaki mendatar 12 → 15, Close: Pad, Pocket, Fillet, dan Chamfer mengikuti tanpa dibuat ulang (volume 67.840,51 mm³). Kembalikan ke 12 dengan cara yang sama: 60.062,21 mm³.</w:t>
       </w:r>
     </w:p>
     <w:p>
@@ -10296,7 +10404,7 @@
           <w:i w:val="0"/>
           <w:sz w:val="22"/>
         </w:rPr>
-        <w:t>Hitung massa aluminium (ρ = 2,70 g/cm³) dari Volume/1000; V lalu F; Ctrl+S → Latihan5_NIM.FCStd.</w:t>
+        <w:t>Python console: round(App.ActiveDocument.Body.Shape.Volume * 2.70 / 1000, 2) → 162,17 g (aluminium, ρ = 2,70 g/cm³). V lalu F; Ctrl+S → Latihan5_NIM.FCStd.</w:t>
       </w:r>
     </w:p>
     <w:p>
@@ -10798,6 +10906,124 @@
                 <w:sz w:val="18"/>
               </w:rPr>
               <w:t>Baca Body.Shape.Volume (Tip)</w:t>
+            </w:r>
+          </w:p>
+        </w:tc>
+      </w:tr>
+      <w:tr>
+        <w:tc>
+          <w:tcPr>
+            <w:tcW w:type="dxa" w:w="2929"/>
+          </w:tcPr>
+          <w:p>
+            <w:pPr>
+              <w:spacing w:after="0"/>
+            </w:pPr>
+            <w:r>
+              <w:rPr>
+                <w:rFonts w:ascii="Arial" w:hAnsi="Arial" w:eastAsia="Arial" w:cs="Arial"/>
+                <w:b w:val="0"/>
+                <w:i w:val="0"/>
+                <w:sz w:val="18"/>
+              </w:rPr>
+              <w:t>Dialog dimensi muncul lagi saat mengklik geometri lain</w:t>
+            </w:r>
+          </w:p>
+        </w:tc>
+        <w:tc>
+          <w:tcPr>
+            <w:tcW w:type="dxa" w:w="2929"/>
+          </w:tcPr>
+          <w:p>
+            <w:pPr>
+              <w:spacing w:after="0"/>
+            </w:pPr>
+            <w:r>
+              <w:rPr>
+                <w:rFonts w:ascii="Arial" w:hAnsi="Arial" w:eastAsia="Arial" w:cs="Arial"/>
+                <w:b w:val="0"/>
+                <w:i w:val="0"/>
+                <w:sz w:val="18"/>
+              </w:rPr>
+              <w:t>Alat dimensi Sketcher masih aktif (mode kontinu)</w:t>
+            </w:r>
+          </w:p>
+        </w:tc>
+        <w:tc>
+          <w:tcPr>
+            <w:tcW w:type="dxa" w:w="2929"/>
+          </w:tcPr>
+          <w:p>
+            <w:pPr>
+              <w:spacing w:after="0"/>
+            </w:pPr>
+            <w:r>
+              <w:rPr>
+                <w:rFonts w:ascii="Arial" w:hAnsi="Arial" w:eastAsia="Arial" w:cs="Arial"/>
+                <w:b w:val="0"/>
+                <w:i w:val="0"/>
+                <w:sz w:val="18"/>
+              </w:rPr>
+              <w:t>Tekan Esc sekali setelah memberi dimensi; Esc kedua menutup sketsa</w:t>
+            </w:r>
+          </w:p>
+        </w:tc>
+      </w:tr>
+      <w:tr>
+        <w:tc>
+          <w:tcPr>
+            <w:tcW w:type="dxa" w:w="2929"/>
+          </w:tcPr>
+          <w:p>
+            <w:pPr>
+              <w:spacing w:after="0"/>
+            </w:pPr>
+            <w:r>
+              <w:rPr>
+                <w:rFonts w:ascii="Arial" w:hAnsi="Arial" w:eastAsia="Arial" w:cs="Arial"/>
+                <w:b w:val="0"/>
+                <w:i w:val="0"/>
+                <w:sz w:val="18"/>
+              </w:rPr>
+              <w:t>Lingkaran sketsa XZ tidak bisa diklik</w:t>
+            </w:r>
+          </w:p>
+        </w:tc>
+        <w:tc>
+          <w:tcPr>
+            <w:tcW w:type="dxa" w:w="2929"/>
+          </w:tcPr>
+          <w:p>
+            <w:pPr>
+              <w:spacing w:after="0"/>
+            </w:pPr>
+            <w:r>
+              <w:rPr>
+                <w:rFonts w:ascii="Arial" w:hAnsi="Arial" w:eastAsia="Arial" w:cs="Arial"/>
+                <w:b w:val="0"/>
+                <w:i w:val="0"/>
+                <w:sz w:val="18"/>
+              </w:rPr>
+              <w:t>Sketsa XZ ditampilkan dari belakang, tertutup benda</w:t>
+            </w:r>
+          </w:p>
+        </w:tc>
+        <w:tc>
+          <w:tcPr>
+            <w:tcW w:type="dxa" w:w="2929"/>
+          </w:tcPr>
+          <w:p>
+            <w:pPr>
+              <w:spacing w:after="0"/>
+            </w:pPr>
+            <w:r>
+              <w:rPr>
+                <w:rFonts w:ascii="Arial" w:hAnsi="Arial" w:eastAsia="Arial" w:cs="Arial"/>
+                <w:b w:val="0"/>
+                <w:i w:val="0"/>
+                <w:sz w:val="18"/>
+              </w:rPr>
+              <w:t>Tekan 1 (Front) selama menyunting sketsa</w:t>
             </w:r>
           </w:p>
         </w:tc>

</xml_diff>

<commit_message>
feat(cad): video Modul 5 versi klik GUI (Braket L) dengan sketsa terkonstrain (#1040)
- Rekaman klik GUI asli 7:50:
  - profil L dengan Polyline, lalu dimensi Sketcher (yang pertama menskalakan profil; jarak dimensi sama)
  - Pad 40; lubang di sketsa XZ (Diameter, Equal, posisi x 49, z 10/30) lalu Pocket Through all
  - Fillet R6 lewat sudut navigation cube; Chamfer 2
  - ubah tebal 12 -> 15 -> 12; massa aluminium 162,17 g
- Teks langkah 1-7 dengan angka volume dari konsol, posisi lubang di Gambar 7, dan dua baris gejala Sketcher.

Co-authored-by: Claude Opus 5.5 <noreply@anthropic.com>
</commit_message>
<xml_diff>
--- a/Pemodelan-Computer-Aided-Design/Modul-Word/Modul-5-Pemodelan-3D-Berbasis-Sketsa-Extrude-Revolve-Sweep.docx
+++ b/Pemodelan-Computer-Aided-Design/Modul-Word/Modul-5-Pemodelan-3D-Berbasis-Sketsa-Extrude-Revolve-Sweep.docx
@@ -10065,7 +10065,7 @@
           <w:i w:val="0"/>
           <w:sz w:val="20"/>
         </w:rPr>
-        <w:t>Gambar 7 — Target praktik: braket L tiga dimensi. Satuan mm. Kiri: profil pada bidang XY dengan titik asal (0, 0) di sudut luar siku, yaitu polyline 6 titik 80 × 60 tebal 12 (langkah 1) setelah fillet dalam R6 (langkah 4) dan chamfer C2 pada dua rusuk luar ujung kaki (langkah 5). Kanan: isometrik setelah Pad 40 (langkah 2) dan dua lubang ⌀9 tembus di muka atas kaki mendatar (langkah 3).</w:t>
+        <w:t>Gambar 7 — Target praktik: braket L tiga dimensi. Satuan mm. Kiri: profil pada bidang XY dengan titik asal (0, 0) di sudut luar siku, yaitu polyline 6 titik 80 × 60 tebal 12 (langkah 1) setelah fillet dalam R6 (langkah 4) dan chamfer C2 pada dua rusuk luar ujung kaki (langkah 5). Kanan: isometrik setelah Pad 40 (langkah 2) dan dua lubang ⌀9 tembus pada kaki mendatar, pusat x 49 dan z 10/30 dari sketsa XZ (langkah 3).</w:t>
       </w:r>
     </w:p>
     <w:p>
@@ -10098,7 +10098,61 @@
           <w:i w:val="0"/>
           <w:sz w:val="22"/>
         </w:rPr>
-        <w:t>Part Design → Create body → Create sketch → XY. Gambar profil L braket: polyline 6 titik (80 × 60, tebal 12), konstrain coincident, H/V, jangkar ke origin, dimensi sampai Fully constrained. Close.</w:t>
+        <w:t xml:space="preserve">File → New Document; Part Design → New Body; Sketch → New Sketch → XY-plane. </w:t>
+      </w:r>
+      <w:r>
+        <w:rPr>
+          <w:rFonts w:ascii="Arial" w:hAnsi="Arial" w:eastAsia="Arial" w:cs="Arial"/>
+          <w:b/>
+          <w:i w:val="0"/>
+          <w:sz w:val="22"/>
+        </w:rPr>
+        <w:t>Polyline</w:t>
+      </w:r>
+      <w:r>
+        <w:rPr>
+          <w:rFonts w:ascii="Arial" w:hAnsi="Arial" w:eastAsia="Arial" w:cs="Arial"/>
+          <w:b w:val="0"/>
+          <w:i w:val="0"/>
+          <w:sz w:val="22"/>
+        </w:rPr>
+        <w:t xml:space="preserve">: klik pertama tepat di titik asal (Coincident otomatis), lalu gambar profil L kasar 6 titik; konstrain Horizontal/Vertical terpasang otomatis. Tekan Esc sekali untuk keluar dari Polyline. Pilih tepi bawah → Horizontal Dimension </w:t>
+      </w:r>
+      <w:r>
+        <w:rPr>
+          <w:rFonts w:ascii="Arial" w:hAnsi="Arial" w:eastAsia="Arial" w:cs="Arial"/>
+          <w:b/>
+          <w:i w:val="0"/>
+          <w:sz w:val="22"/>
+        </w:rPr>
+        <w:t>80</w:t>
+      </w:r>
+      <w:r>
+        <w:rPr>
+          <w:rFonts w:ascii="Arial" w:hAnsi="Arial" w:eastAsia="Arial" w:cs="Arial"/>
+          <w:b w:val="0"/>
+          <w:i w:val="0"/>
+          <w:sz w:val="22"/>
+        </w:rPr>
+        <w:t xml:space="preserve">: dimensi pertama menskalakan seluruh profil; Fit All. Tepi kiri → Vertical Dimension 60; tepi kanan kaki mendatar → Vertical 12; tepi atas kaki tegak → Horizontal 12. Seret angka yang jatuh di dalam profil ke luar agar semua dimensi berjarak sama (±7 mm). Panel Sketch Edit menulis </w:t>
+      </w:r>
+      <w:r>
+        <w:rPr>
+          <w:rFonts w:ascii="Arial" w:hAnsi="Arial" w:eastAsia="Arial" w:cs="Arial"/>
+          <w:b w:val="0"/>
+          <w:i/>
+          <w:sz w:val="22"/>
+        </w:rPr>
+        <w:t>Fully constrained</w:t>
+      </w:r>
+      <w:r>
+        <w:rPr>
+          <w:rFonts w:ascii="Arial" w:hAnsi="Arial" w:eastAsia="Arial" w:cs="Arial"/>
+          <w:b w:val="0"/>
+          <w:i w:val="0"/>
+          <w:sz w:val="22"/>
+        </w:rPr>
+        <w:t xml:space="preserve"> → Close.</w:t>
       </w:r>
     </w:p>
     <w:p>
@@ -10131,7 +10185,7 @@
           <w:i w:val="0"/>
           <w:sz w:val="22"/>
         </w:rPr>
-        <w:t>Pad Length 40 mm. Baca Body.Shape.Volume di Python console dan bandingkan dengan luas profil × 40.</w:t>
+        <w:t>Pilih Sketch → Additive Features → Pad, Length 40 → OK; tekan 0 untuk tampilan isometrik. Python console: round(App.ActiveDocument.Body.Shape.Volume, 2) → 61.440,0 mm³ = luas profil 1.536 mm² × 40.</w:t>
       </w:r>
     </w:p>
     <w:p>
@@ -10164,7 +10218,43 @@
           <w:i w:val="0"/>
           <w:sz w:val="22"/>
         </w:rPr>
-        <w:t>Klik muka atas kaki mendatar → Create sketch → dua lingkaran ⌀9 (konstrain Diameter, posisi dari tepi) → Pocket Through all. Volume berkurang 2 × π·4,5² × 12.</w:t>
+        <w:t xml:space="preserve">Sketch → New Sketch → </w:t>
+      </w:r>
+      <w:r>
+        <w:rPr>
+          <w:rFonts w:ascii="Arial" w:hAnsi="Arial" w:eastAsia="Arial" w:cs="Arial"/>
+          <w:b/>
+          <w:i w:val="0"/>
+          <w:sz w:val="22"/>
+        </w:rPr>
+        <w:t>XZ-plane</w:t>
+      </w:r>
+      <w:r>
+        <w:rPr>
+          <w:rFonts w:ascii="Arial" w:hAnsi="Arial" w:eastAsia="Arial" w:cs="Arial"/>
+          <w:b w:val="0"/>
+          <w:i w:val="0"/>
+          <w:sz w:val="22"/>
+        </w:rPr>
+        <w:t xml:space="preserve"> (muka luar kaki mendatar), lalu tekan 1 (Front) karena sketsa XZ ditampilkan dari belakang. Circle From Center dua kali, Esc. Tepi lingkaran → Diameter Dimension 9; dua lingkaran → Equal; pusat pertama → Horizontal 49 dan Vertical 10; dua pusat → Vertical Constraint; pusat kedua → Vertical 30. Fully constrained → Close. Pilih Sketch001 → Pocket, Type </w:t>
+      </w:r>
+      <w:r>
+        <w:rPr>
+          <w:rFonts w:ascii="Arial" w:hAnsi="Arial" w:eastAsia="Arial" w:cs="Arial"/>
+          <w:b/>
+          <w:i w:val="0"/>
+          <w:sz w:val="22"/>
+        </w:rPr>
+        <w:t>Through all</w:t>
+      </w:r>
+      <w:r>
+        <w:rPr>
+          <w:rFonts w:ascii="Arial" w:hAnsi="Arial" w:eastAsia="Arial" w:cs="Arial"/>
+          <w:b w:val="0"/>
+          <w:i w:val="0"/>
+          <w:sz w:val="22"/>
+        </w:rPr>
+        <w:t>: volume 59.913,19 mm³ (berkurang 2 × π·4,5² × 12).</w:t>
       </w:r>
     </w:p>
     <w:p>
@@ -10197,7 +10287,25 @@
           <w:i w:val="0"/>
           <w:sz w:val="22"/>
         </w:rPr>
-        <w:t>Pilih rusuk dalam siku L (satu rusuk sepanjang 40 mm) → Fillet R6. Volume bertambah? Ya: fillet dalam mengisi sudut dalam dengan bahan; hitung selisihnya lewat Shape.Volume.</w:t>
+        <w:t xml:space="preserve">Rusuk dalam siku tertutup dinding pada tampilan isometrik biasa: klik sudut belakang-kanan-atas navigation cube. Pilih rusuk dalam (sepanjang 40 mm) → Dress-Up Features → Fillet, Radius 6 → OK. Volume </w:t>
+      </w:r>
+      <w:r>
+        <w:rPr>
+          <w:rFonts w:ascii="Arial" w:hAnsi="Arial" w:eastAsia="Arial" w:cs="Arial"/>
+          <w:b w:val="0"/>
+          <w:i/>
+          <w:sz w:val="22"/>
+        </w:rPr>
+        <w:t>bertambah</w:t>
+      </w:r>
+      <w:r>
+        <w:rPr>
+          <w:rFonts w:ascii="Arial" w:hAnsi="Arial" w:eastAsia="Arial" w:cs="Arial"/>
+          <w:b w:val="0"/>
+          <w:i w:val="0"/>
+          <w:sz w:val="22"/>
+        </w:rPr>
+        <w:t xml:space="preserve"> menjadi 60.222,21 mm³: fillet dalam mengisi sudut dengan bahan ≈ (1 − π/4)·6²·40 = 309,03 mm³.</w:t>
       </w:r>
     </w:p>
     <w:p>
@@ -10230,7 +10338,7 @@
           <w:i w:val="0"/>
           <w:sz w:val="22"/>
         </w:rPr>
-        <w:t>Pilih dua rusuk luar ujung kaki → Chamfer 2 mm. Periksa pohon fitur: Sketch, Pad, Sketch001, Pocket, Fillet, Chamfer; Tip = Chamfer.</w:t>
+        <w:t>Klik rusuk luar ujung kaki mendatar, Ctrl+klik rusuk luar ujung kaki tegak → Chamfer, Size 2 → OK. Pohon fitur: Sketch, Pad, Sketch001, Pocket, Fillet, Chamfer; Tip = Chamfer.</w:t>
       </w:r>
     </w:p>
     <w:p>
@@ -10263,7 +10371,7 @@
           <w:i w:val="0"/>
           <w:sz w:val="22"/>
         </w:rPr>
-        <w:t>Buka Sketch, ubah tebal 12 → 15, Close, recompute: semua fitur mengikuti tanpa dibuat ulang. Kembalikan ke 12.</w:t>
+        <w:t>Klik ganda Sketch, klik ganda angka tebal kaki mendatar 12 → 15, Close: Pad, Pocket, Fillet, dan Chamfer mengikuti tanpa dibuat ulang (volume 67.840,51 mm³). Kembalikan ke 12 dengan cara yang sama: 60.062,21 mm³.</w:t>
       </w:r>
     </w:p>
     <w:p>
@@ -10296,7 +10404,7 @@
           <w:i w:val="0"/>
           <w:sz w:val="22"/>
         </w:rPr>
-        <w:t>Hitung massa aluminium (ρ = 2,70 g/cm³) dari Volume/1000; V lalu F; Ctrl+S → Latihan5_NIM.FCStd.</w:t>
+        <w:t>Python console: round(App.ActiveDocument.Body.Shape.Volume * 2.70 / 1000, 2) → 162,17 g (aluminium, ρ = 2,70 g/cm³). V lalu F; Ctrl+S → Latihan5_NIM.FCStd.</w:t>
       </w:r>
     </w:p>
     <w:p>
@@ -10798,6 +10906,124 @@
                 <w:sz w:val="18"/>
               </w:rPr>
               <w:t>Baca Body.Shape.Volume (Tip)</w:t>
+            </w:r>
+          </w:p>
+        </w:tc>
+      </w:tr>
+      <w:tr>
+        <w:tc>
+          <w:tcPr>
+            <w:tcW w:type="dxa" w:w="2929"/>
+          </w:tcPr>
+          <w:p>
+            <w:pPr>
+              <w:spacing w:after="0"/>
+            </w:pPr>
+            <w:r>
+              <w:rPr>
+                <w:rFonts w:ascii="Arial" w:hAnsi="Arial" w:eastAsia="Arial" w:cs="Arial"/>
+                <w:b w:val="0"/>
+                <w:i w:val="0"/>
+                <w:sz w:val="18"/>
+              </w:rPr>
+              <w:t>Dialog dimensi muncul lagi saat mengklik geometri lain</w:t>
+            </w:r>
+          </w:p>
+        </w:tc>
+        <w:tc>
+          <w:tcPr>
+            <w:tcW w:type="dxa" w:w="2929"/>
+          </w:tcPr>
+          <w:p>
+            <w:pPr>
+              <w:spacing w:after="0"/>
+            </w:pPr>
+            <w:r>
+              <w:rPr>
+                <w:rFonts w:ascii="Arial" w:hAnsi="Arial" w:eastAsia="Arial" w:cs="Arial"/>
+                <w:b w:val="0"/>
+                <w:i w:val="0"/>
+                <w:sz w:val="18"/>
+              </w:rPr>
+              <w:t>Alat dimensi Sketcher masih aktif (mode kontinu)</w:t>
+            </w:r>
+          </w:p>
+        </w:tc>
+        <w:tc>
+          <w:tcPr>
+            <w:tcW w:type="dxa" w:w="2929"/>
+          </w:tcPr>
+          <w:p>
+            <w:pPr>
+              <w:spacing w:after="0"/>
+            </w:pPr>
+            <w:r>
+              <w:rPr>
+                <w:rFonts w:ascii="Arial" w:hAnsi="Arial" w:eastAsia="Arial" w:cs="Arial"/>
+                <w:b w:val="0"/>
+                <w:i w:val="0"/>
+                <w:sz w:val="18"/>
+              </w:rPr>
+              <w:t>Tekan Esc sekali setelah memberi dimensi; Esc kedua menutup sketsa</w:t>
+            </w:r>
+          </w:p>
+        </w:tc>
+      </w:tr>
+      <w:tr>
+        <w:tc>
+          <w:tcPr>
+            <w:tcW w:type="dxa" w:w="2929"/>
+          </w:tcPr>
+          <w:p>
+            <w:pPr>
+              <w:spacing w:after="0"/>
+            </w:pPr>
+            <w:r>
+              <w:rPr>
+                <w:rFonts w:ascii="Arial" w:hAnsi="Arial" w:eastAsia="Arial" w:cs="Arial"/>
+                <w:b w:val="0"/>
+                <w:i w:val="0"/>
+                <w:sz w:val="18"/>
+              </w:rPr>
+              <w:t>Lingkaran sketsa XZ tidak bisa diklik</w:t>
+            </w:r>
+          </w:p>
+        </w:tc>
+        <w:tc>
+          <w:tcPr>
+            <w:tcW w:type="dxa" w:w="2929"/>
+          </w:tcPr>
+          <w:p>
+            <w:pPr>
+              <w:spacing w:after="0"/>
+            </w:pPr>
+            <w:r>
+              <w:rPr>
+                <w:rFonts w:ascii="Arial" w:hAnsi="Arial" w:eastAsia="Arial" w:cs="Arial"/>
+                <w:b w:val="0"/>
+                <w:i w:val="0"/>
+                <w:sz w:val="18"/>
+              </w:rPr>
+              <w:t>Sketsa XZ ditampilkan dari belakang, tertutup benda</w:t>
+            </w:r>
+          </w:p>
+        </w:tc>
+        <w:tc>
+          <w:tcPr>
+            <w:tcW w:type="dxa" w:w="2929"/>
+          </w:tcPr>
+          <w:p>
+            <w:pPr>
+              <w:spacing w:after="0"/>
+            </w:pPr>
+            <w:r>
+              <w:rPr>
+                <w:rFonts w:ascii="Arial" w:hAnsi="Arial" w:eastAsia="Arial" w:cs="Arial"/>
+                <w:b w:val="0"/>
+                <w:i w:val="0"/>
+                <w:sz w:val="18"/>
+              </w:rPr>
+              <w:t>Tekan 1 (Front) selama menyunting sketsa</w:t>
             </w:r>
           </w:p>
         </w:tc>

</xml_diff>